<commit_message>
Unify estate document generation pipeline: consolidate backend logic in unified-generator.ts, enhance binary support, and streamline frontend UI
</commit_message>
<xml_diff>
--- a/functions/templates/NJ_Will_Single.docx
+++ b/functions/templates/NJ_Will_Single.docx
@@ -216,7 +216,7 @@
           <w:b/>
           <w:bCs/>
         </w:rPr>
-        <w:t>ANTHONY ESERNIO</w:t>
+        <w:t>{successor_executor}</w:t>
       </w:r>
       <w:r>
         <w:t xml:space="preserve">, </w:t>
@@ -765,7 +765,7 @@
           <w:b/>
           <w:bCs/>
         </w:rPr>
-        <w:t>ANTHONY ESERNIO</w:t>
+        <w:t>{successor_executor}</w:t>
       </w:r>
       <w:r>
         <w:rPr>
@@ -1695,7 +1695,7 @@
           <w:b/>
           <w:bCs/>
         </w:rPr>
-        <w:t>ANTHONY ESERNIO</w:t>
+        <w:t>{successor_executor}</w:t>
       </w:r>
       <w:r>
         <w:t xml:space="preserve"> and </w:t>

</xml_diff>